<commit_message>
6/Networking Add picture borders
</commit_message>
<xml_diff>
--- a/Term6/Networking/lab-1/report.docx
+++ b/Term6/Networking/lab-1/report.docx
@@ -751,10 +751,13 @@
         <w:pStyle w:val="NoSpacing"/>
       </w:pPr>
       <w:r>
+        <w:rPr>
+          <w:noProof/>
+        </w:rPr>
         <w:drawing>
-          <wp:inline distT="0" distB="0" distL="0" distR="0" wp14:anchorId="4E936F37" wp14:editId="690060FC">
+          <wp:inline distT="0" distB="0" distL="0" distR="0" wp14:anchorId="4E936F37" wp14:editId="0A1C2821">
             <wp:extent cx="5940425" cy="2223770"/>
-            <wp:effectExtent l="0" t="0" r="3175" b="5080"/>
+            <wp:effectExtent l="19050" t="19050" r="22225" b="24130"/>
             <wp:docPr id="1567286612" name="Picture 1"/>
             <wp:cNvGraphicFramePr>
               <a:graphicFrameLocks xmlns:a="http://schemas.openxmlformats.org/drawingml/2006/main" noChangeAspect="1"/>
@@ -780,6 +783,11 @@
                     <a:prstGeom prst="rect">
                       <a:avLst/>
                     </a:prstGeom>
+                    <a:ln>
+                      <a:solidFill>
+                        <a:schemeClr val="tx1"/>
+                      </a:solidFill>
+                    </a:ln>
                   </pic:spPr>
                 </pic:pic>
               </a:graphicData>
@@ -803,10 +811,13 @@
         <w:jc w:val="center"/>
       </w:pPr>
       <w:r>
+        <w:rPr>
+          <w:noProof/>
+        </w:rPr>
         <w:drawing>
-          <wp:inline distT="0" distB="0" distL="0" distR="0" wp14:anchorId="7A1C9B03" wp14:editId="3673C823">
+          <wp:inline distT="0" distB="0" distL="0" distR="0" wp14:anchorId="7A1C9B03" wp14:editId="74980C79">
             <wp:extent cx="2848373" cy="562053"/>
-            <wp:effectExtent l="0" t="0" r="9525" b="0"/>
+            <wp:effectExtent l="19050" t="19050" r="28575" b="9525"/>
             <wp:docPr id="106588207" name="Picture 1"/>
             <wp:cNvGraphicFramePr>
               <a:graphicFrameLocks xmlns:a="http://schemas.openxmlformats.org/drawingml/2006/main" noChangeAspect="1"/>
@@ -832,6 +843,11 @@
                     <a:prstGeom prst="rect">
                       <a:avLst/>
                     </a:prstGeom>
+                    <a:ln>
+                      <a:solidFill>
+                        <a:schemeClr val="tx1"/>
+                      </a:solidFill>
+                    </a:ln>
                   </pic:spPr>
                 </pic:pic>
               </a:graphicData>

</xml_diff>